<commit_message>
docs: integrate 1000-question benchmark into XLSX and update DOCX manifesto
</commit_message>
<xml_diff>
--- a/docs/SymboLM_Research_Whitepaper_Sanish_Gyawali.docx
+++ b/docs/SymboLM_Research_Whitepaper_Sanish_Gyawali.docx
@@ -13,7 +13,7 @@
           <w:color w:val="2563EB"/>
           <w:sz w:val="17"/>
         </w:rPr>
-        <w:t>ADVANCED AI RESEARCH WHITEPAPER · TECHNICAL EVALUATION &amp; GRANT DOSSIER</w:t>
+        <w:t>ADVANCED AI RESEARCH WHITEPAPER · TECHNICAL MANIFESTO &amp; ARCHITECTURE</w:t>
         <w:br/>
       </w:r>
     </w:p>
@@ -152,16 +152,16 @@
                 <w:color w:val="64748B"/>
                 <w:sz w:val="16"/>
               </w:rPr>
-              <w:t>TARGET FELLOWSHIPS &amp; GRANTS:</w:t>
+              <w:t>AFFILIATION &amp; ORIGIN:</w:t>
               <w:br/>
             </w:r>
             <w:r>
               <w:rPr>
                 <w:sz w:val="17"/>
               </w:rPr>
-              <w:t>Emergent Ventures (Dr. Tyler Cowen, $20,000)</w:t>
+              <w:t>Independent Research Laboratory</w:t>
               <w:br/>
-              <w:t>1517 Fund Medici Grants ($1,000 – $5,000)</w:t>
+              <w:t>Rupandehi, Nepal</w:t>
             </w:r>
           </w:p>
         </w:tc>
@@ -4139,7 +4139,7 @@
           <w:color w:val="0F172A"/>
           <w:sz w:val="28"/>
         </w:rPr>
-        <w:t>4. Fellowship Grant Allocation &amp; Impact Plan ($20,000 – $25,000)</w:t>
+        <w:t>4. Future Research Horizons &amp; Systems Scaling</w:t>
       </w:r>
     </w:p>
     <w:p>
@@ -4147,7 +4147,7 @@
         <w:spacing w:before="0" w:after="100" w:line="276" w:lineRule="auto"/>
       </w:pPr>
       <w:r>
-        <w:t>An unrestricted fellowship grant from Emergent Ventures or the 1517 Fund permanently removes the physical, infrastructural, and computational bottlenecks constraining independent research in Rupandehi, Nepal:</w:t>
+        <w:t>The empirical verification of Register v2.0 and the Unbounded Parsimony Gradient on 1.5B parameters establishes the foundational proof-of-concept for biomimetic reasoning. Future architectural frontiers include:</w:t>
       </w:r>
     </w:p>
     <w:tbl>
@@ -4180,7 +4180,7 @@
                 <w:color w:val="FFFFFF"/>
                 <w:sz w:val="17"/>
               </w:rPr>
-              <w:t>Budget Category</w:t>
+              <w:t>Research Frontier</w:t>
             </w:r>
           </w:p>
         </w:tc>
@@ -4202,7 +4202,7 @@
                 <w:color w:val="FFFFFF"/>
                 <w:sz w:val="17"/>
               </w:rPr>
-              <w:t>Allocation</w:t>
+              <w:t>Target Objective</w:t>
             </w:r>
           </w:p>
         </w:tc>
@@ -4224,7 +4224,7 @@
                 <w:color w:val="FFFFFF"/>
                 <w:sz w:val="17"/>
               </w:rPr>
-              <w:t>Operational Impact &amp; Deliverables</w:t>
+              <w:t>Technical &amp; Algorithmic Mechanism</w:t>
             </w:r>
           </w:p>
         </w:tc>
@@ -4247,7 +4247,7 @@
                 <w:b/>
                 <w:sz w:val="17"/>
               </w:rPr>
-              <w:t>1. Electrical &amp; Power Resilience (Nepal)</w:t>
+              <w:t>1. Foundation Model Scaling</w:t>
             </w:r>
           </w:p>
         </w:tc>
@@ -4268,7 +4268,7 @@
                 <w:b/>
                 <w:sz w:val="17"/>
               </w:rPr>
-              <w:t>$5,000</w:t>
+              <w:t>7B / 14B / 32B Architectures</w:t>
             </w:r>
           </w:p>
         </w:tc>
@@ -4288,7 +4288,7 @@
               <w:rPr>
                 <w:sz w:val="17"/>
               </w:rPr>
-              <w:t>Pure sine-wave inverter, LiFePO4 battery storage (0ms switchover), and dual-WAN failover router to ensure continuous connection during regional grid blackouts.</w:t>
+              <w:t>Applying Parsimony GRPO and Tri-Register conditioning to larger open-weight reasoning backbones to unlock deeper mathematical invariant discovery.</w:t>
             </w:r>
           </w:p>
         </w:tc>
@@ -4311,7 +4311,7 @@
                 <w:b/>
                 <w:sz w:val="17"/>
               </w:rPr>
-              <w:t>2. Dedicated Cloud Compute Clusters</w:t>
+              <w:t>2. Formal Theorem Prover Integration</w:t>
             </w:r>
           </w:p>
         </w:tc>
@@ -4332,7 +4332,7 @@
                 <w:b/>
                 <w:sz w:val="17"/>
               </w:rPr>
-              <w:t>$10,000 – $12,000</w:t>
+              <w:t>Automated Soundness Engine</w:t>
             </w:r>
           </w:p>
         </w:tc>
@@ -4352,7 +4352,7 @@
               <w:rPr>
                 <w:sz w:val="17"/>
               </w:rPr>
-              <w:t>Dedicated A100/H100 GPU clusters (Lambda Labs / RunPod) to scale SymboLM from 1.5B parameters to 14B and 32B foundation models, executing multi-thousand sample GRPO rollouts.</w:t>
+              <w:t>Coupling the verification register (&lt;reg:verify&gt;) directly with formal proof checkers (Lean 4, Isabelle, SymPy) for compile-time sound reasoning.</w:t>
             </w:r>
           </w:p>
         </w:tc>
@@ -4375,7 +4375,7 @@
                 <w:b/>
                 <w:sz w:val="17"/>
               </w:rPr>
-              <w:t>3. Living &amp; Physical Care Runway</w:t>
+              <w:t>3. Real-Time Edge &amp; Robotics</w:t>
             </w:r>
           </w:p>
         </w:tc>
@@ -4396,7 +4396,7 @@
                 <w:b/>
                 <w:sz w:val="17"/>
               </w:rPr>
-              <w:t>$5,000 – $8,000</w:t>
+              <w:t>Sub-50ms Low-Latency Inference</w:t>
             </w:r>
           </w:p>
         </w:tc>
@@ -4416,7 +4416,7 @@
               <w:rPr>
                 <w:sz w:val="17"/>
               </w:rPr>
-              <w:t>12-month domestic and caregiving assistance runway in Rupandehi, Nepal, providing physical autonomy to conduct full-time independent AI research.</w:t>
+              <w:t>Leveraging the 4-bit GGUF quantization (34.3 tok/s on CPU) and 0-step factual bypass for deterministic local decision engines.</w:t>
             </w:r>
           </w:p>
         </w:tc>

</xml_diff>